<commit_message>
Promote equifinality figure from Fig. S4 to Fig. 6 (main figure)
- Rename plot_figS4_equifinality.py → plot_fig6_equifinality.py
- Output path updated to fig6_equifinality.png
- Update figure_captions.docx: Fig. 6 added to main figures section, S4 removed
- Results draft updated: Fig. S4 → Fig. 6 in §3.3 text

Co-Authored-By: Claude Sonnet 4.6 <noreply@anthropic.com>
</commit_message>
<xml_diff>
--- a/publication/figure_captions.docx
+++ b/publication/figure_captions.docx
@@ -574,6 +574,194 @@
     </w:p>
     <w:p>
       <w:pPr>
+        <w:spacing w:before="120" w:after="200"/>
+      </w:pPr>
+      <w:r>
+        <w:rPr>
+          <w:rFonts w:ascii="Times New Roman" w:hAnsi="Times New Roman"/>
+          <w:b/>
+          <w:sz w:val="24"/>
+        </w:rPr>
+        <w:t xml:space="preserve">Figure 6. </w:t>
+      </w:r>
+      <w:r>
+        <w:rPr>
+          <w:rFonts w:ascii="Times New Roman" w:hAnsi="Times New Roman"/>
+          <w:b w:val="0"/>
+          <w:i w:val="0"/>
+          <w:sz w:val="24"/>
+        </w:rPr>
+        <w:t>Equifinality in the inverse-modelling approach: relationship between the CMA-ES final objective value (</w:t>
+      </w:r>
+      <w:r>
+        <w:rPr>
+          <w:rFonts w:ascii="Times New Roman" w:hAnsi="Times New Roman"/>
+          <w:b w:val="0"/>
+          <w:i/>
+          <w:sz w:val="24"/>
+        </w:rPr>
+        <w:t>J</w:t>
+      </w:r>
+      <w:r>
+        <w:rPr>
+          <w:rFonts w:ascii="Times New Roman" w:hAnsi="Times New Roman"/>
+          <w:b w:val="0"/>
+          <w:i w:val="0"/>
+          <w:sz w:val="24"/>
+          <w:vertAlign w:val="subscript"/>
+        </w:rPr>
+        <w:t>best</w:t>
+      </w:r>
+      <w:r>
+        <w:rPr>
+          <w:rFonts w:ascii="Times New Roman" w:hAnsi="Times New Roman"/>
+          <w:b w:val="0"/>
+          <w:i w:val="0"/>
+          <w:sz w:val="24"/>
+        </w:rPr>
+        <w:t>) and 3D structural skill scores (SS</w:t>
+      </w:r>
+      <w:r>
+        <w:rPr>
+          <w:rFonts w:ascii="Times New Roman" w:hAnsi="Times New Roman"/>
+          <w:b w:val="0"/>
+          <w:i w:val="0"/>
+          <w:sz w:val="24"/>
+          <w:vertAlign w:val="subscript"/>
+        </w:rPr>
+        <w:t>RLD</w:t>
+      </w:r>
+      <w:r>
+        <w:rPr>
+          <w:rFonts w:ascii="Times New Roman" w:hAnsi="Times New Roman"/>
+          <w:b w:val="0"/>
+          <w:i w:val="0"/>
+          <w:sz w:val="24"/>
+        </w:rPr>
+        <w:t>, left columns; SS</w:t>
+      </w:r>
+      <w:r>
+        <w:rPr>
+          <w:rFonts w:ascii="Times New Roman" w:hAnsi="Times New Roman"/>
+          <w:b w:val="0"/>
+          <w:i w:val="0"/>
+          <w:sz w:val="24"/>
+          <w:vertAlign w:val="subscript"/>
+        </w:rPr>
+        <w:t>angle</w:t>
+      </w:r>
+      <w:r>
+        <w:rPr>
+          <w:rFonts w:ascii="Times New Roman" w:hAnsi="Times New Roman"/>
+          <w:b w:val="0"/>
+          <w:i w:val="0"/>
+          <w:sz w:val="24"/>
+        </w:rPr>
+        <w:t xml:space="preserve">, right columns) across the 20 test cases, for </w:t>
+      </w:r>
+      <w:r>
+        <w:rPr>
+          <w:rFonts w:ascii="Times New Roman" w:hAnsi="Times New Roman"/>
+          <w:b w:val="0"/>
+          <w:i/>
+          <w:sz w:val="24"/>
+        </w:rPr>
+        <w:t>k</w:t>
+      </w:r>
+      <w:r>
+        <w:rPr>
+          <w:rFonts w:ascii="Times New Roman" w:hAnsi="Times New Roman"/>
+          <w:b w:val="0"/>
+          <w:i w:val="0"/>
+          <w:sz w:val="24"/>
+        </w:rPr>
+        <w:t xml:space="preserve"> = 1 (top row), </w:t>
+      </w:r>
+      <w:r>
+        <w:rPr>
+          <w:rFonts w:ascii="Times New Roman" w:hAnsi="Times New Roman"/>
+          <w:b w:val="0"/>
+          <w:i/>
+          <w:sz w:val="24"/>
+        </w:rPr>
+        <w:t>k</w:t>
+      </w:r>
+      <w:r>
+        <w:rPr>
+          <w:rFonts w:ascii="Times New Roman" w:hAnsi="Times New Roman"/>
+          <w:b w:val="0"/>
+          <w:i w:val="0"/>
+          <w:sz w:val="24"/>
+        </w:rPr>
+        <w:t xml:space="preserve"> = 7 (middle row), and </w:t>
+      </w:r>
+      <w:r>
+        <w:rPr>
+          <w:rFonts w:ascii="Times New Roman" w:hAnsi="Times New Roman"/>
+          <w:b w:val="0"/>
+          <w:i/>
+          <w:sz w:val="24"/>
+        </w:rPr>
+        <w:t>k</w:t>
+      </w:r>
+      <w:r>
+        <w:rPr>
+          <w:rFonts w:ascii="Times New Roman" w:hAnsi="Times New Roman"/>
+          <w:b w:val="0"/>
+          <w:i w:val="0"/>
+          <w:sz w:val="24"/>
+        </w:rPr>
+        <w:t xml:space="preserve"> = 14 (bottom row). Results are shown separately for Scenario 1 (all parameters unknown; left two columns) and Scenario 2 (elongation fixed; right two columns). Points are coloured by planting configuration (A, B, C, D). The dashed line is the linear regression fit and Pearson </w:t>
+      </w:r>
+      <w:r>
+        <w:rPr>
+          <w:rFonts w:ascii="Times New Roman" w:hAnsi="Times New Roman"/>
+          <w:b w:val="0"/>
+          <w:i/>
+          <w:sz w:val="24"/>
+        </w:rPr>
+        <w:t>r</w:t>
+      </w:r>
+      <w:r>
+        <w:rPr>
+          <w:rFonts w:ascii="Times New Roman" w:hAnsi="Times New Roman"/>
+          <w:b w:val="0"/>
+          <w:i w:val="0"/>
+          <w:sz w:val="24"/>
+        </w:rPr>
+        <w:t xml:space="preserve"> is annotated on each panel. A low </w:t>
+      </w:r>
+      <w:r>
+        <w:rPr>
+          <w:rFonts w:ascii="Times New Roman" w:hAnsi="Times New Roman"/>
+          <w:b w:val="0"/>
+          <w:i/>
+          <w:sz w:val="24"/>
+        </w:rPr>
+        <w:t>J</w:t>
+      </w:r>
+      <w:r>
+        <w:rPr>
+          <w:rFonts w:ascii="Times New Roman" w:hAnsi="Times New Roman"/>
+          <w:b w:val="0"/>
+          <w:i w:val="0"/>
+          <w:sz w:val="24"/>
+          <w:vertAlign w:val="subscript"/>
+        </w:rPr>
+        <w:t>best</w:t>
+      </w:r>
+      <w:r>
+        <w:rPr>
+          <w:rFonts w:ascii="Times New Roman" w:hAnsi="Times New Roman"/>
+          <w:b w:val="0"/>
+          <w:i w:val="0"/>
+          <w:sz w:val="24"/>
+        </w:rPr>
+        <w:t xml:space="preserve"> (good minirhizotron fit) does not guarantee high structural skill score, demonstrating parameter equifinality.</w:t>
+      </w:r>
+    </w:p>
+    <w:p>
+      <w:pPr>
         <w:pBdr>
           <w:bottom w:val="single" w:sz="6" w:space="1" w:color="888888"/>
         </w:pBdr>
@@ -1043,194 +1231,6 @@
         <w:t xml:space="preserve"> = 14 (rows 3–4). Layout and colour coding follow Fig. 4.</w:t>
       </w:r>
     </w:p>
-    <w:p>
-      <w:pPr>
-        <w:spacing w:before="120" w:after="200"/>
-      </w:pPr>
-      <w:r>
-        <w:rPr>
-          <w:rFonts w:ascii="Times New Roman" w:hAnsi="Times New Roman"/>
-          <w:b/>
-          <w:sz w:val="24"/>
-        </w:rPr>
-        <w:t xml:space="preserve">Figure S4. </w:t>
-      </w:r>
-      <w:r>
-        <w:rPr>
-          <w:rFonts w:ascii="Times New Roman" w:hAnsi="Times New Roman"/>
-          <w:b w:val="0"/>
-          <w:i w:val="0"/>
-          <w:sz w:val="24"/>
-        </w:rPr>
-        <w:t>Equifinality in the inverse-modelling approach: relationship between the CMA-ES final objective value (</w:t>
-      </w:r>
-      <w:r>
-        <w:rPr>
-          <w:rFonts w:ascii="Times New Roman" w:hAnsi="Times New Roman"/>
-          <w:b w:val="0"/>
-          <w:i/>
-          <w:sz w:val="24"/>
-        </w:rPr>
-        <w:t>J</w:t>
-      </w:r>
-      <w:r>
-        <w:rPr>
-          <w:rFonts w:ascii="Times New Roman" w:hAnsi="Times New Roman"/>
-          <w:b w:val="0"/>
-          <w:i w:val="0"/>
-          <w:sz w:val="24"/>
-          <w:vertAlign w:val="subscript"/>
-        </w:rPr>
-        <w:t>best</w:t>
-      </w:r>
-      <w:r>
-        <w:rPr>
-          <w:rFonts w:ascii="Times New Roman" w:hAnsi="Times New Roman"/>
-          <w:b w:val="0"/>
-          <w:i w:val="0"/>
-          <w:sz w:val="24"/>
-        </w:rPr>
-        <w:t>) and 3D structural skill scores (SS</w:t>
-      </w:r>
-      <w:r>
-        <w:rPr>
-          <w:rFonts w:ascii="Times New Roman" w:hAnsi="Times New Roman"/>
-          <w:b w:val="0"/>
-          <w:i w:val="0"/>
-          <w:sz w:val="24"/>
-          <w:vertAlign w:val="subscript"/>
-        </w:rPr>
-        <w:t>RLD</w:t>
-      </w:r>
-      <w:r>
-        <w:rPr>
-          <w:rFonts w:ascii="Times New Roman" w:hAnsi="Times New Roman"/>
-          <w:b w:val="0"/>
-          <w:i w:val="0"/>
-          <w:sz w:val="24"/>
-        </w:rPr>
-        <w:t>, left columns; SS</w:t>
-      </w:r>
-      <w:r>
-        <w:rPr>
-          <w:rFonts w:ascii="Times New Roman" w:hAnsi="Times New Roman"/>
-          <w:b w:val="0"/>
-          <w:i w:val="0"/>
-          <w:sz w:val="24"/>
-          <w:vertAlign w:val="subscript"/>
-        </w:rPr>
-        <w:t>angle</w:t>
-      </w:r>
-      <w:r>
-        <w:rPr>
-          <w:rFonts w:ascii="Times New Roman" w:hAnsi="Times New Roman"/>
-          <w:b w:val="0"/>
-          <w:i w:val="0"/>
-          <w:sz w:val="24"/>
-        </w:rPr>
-        <w:t xml:space="preserve">, right columns) across the 20 test cases, for </w:t>
-      </w:r>
-      <w:r>
-        <w:rPr>
-          <w:rFonts w:ascii="Times New Roman" w:hAnsi="Times New Roman"/>
-          <w:b w:val="0"/>
-          <w:i/>
-          <w:sz w:val="24"/>
-        </w:rPr>
-        <w:t>k</w:t>
-      </w:r>
-      <w:r>
-        <w:rPr>
-          <w:rFonts w:ascii="Times New Roman" w:hAnsi="Times New Roman"/>
-          <w:b w:val="0"/>
-          <w:i w:val="0"/>
-          <w:sz w:val="24"/>
-        </w:rPr>
-        <w:t xml:space="preserve"> = 1 (top row), </w:t>
-      </w:r>
-      <w:r>
-        <w:rPr>
-          <w:rFonts w:ascii="Times New Roman" w:hAnsi="Times New Roman"/>
-          <w:b w:val="0"/>
-          <w:i/>
-          <w:sz w:val="24"/>
-        </w:rPr>
-        <w:t>k</w:t>
-      </w:r>
-      <w:r>
-        <w:rPr>
-          <w:rFonts w:ascii="Times New Roman" w:hAnsi="Times New Roman"/>
-          <w:b w:val="0"/>
-          <w:i w:val="0"/>
-          <w:sz w:val="24"/>
-        </w:rPr>
-        <w:t xml:space="preserve"> = 7 (middle row), and </w:t>
-      </w:r>
-      <w:r>
-        <w:rPr>
-          <w:rFonts w:ascii="Times New Roman" w:hAnsi="Times New Roman"/>
-          <w:b w:val="0"/>
-          <w:i/>
-          <w:sz w:val="24"/>
-        </w:rPr>
-        <w:t>k</w:t>
-      </w:r>
-      <w:r>
-        <w:rPr>
-          <w:rFonts w:ascii="Times New Roman" w:hAnsi="Times New Roman"/>
-          <w:b w:val="0"/>
-          <w:i w:val="0"/>
-          <w:sz w:val="24"/>
-        </w:rPr>
-        <w:t xml:space="preserve"> = 14 (bottom row). Results are shown separately for Scenario 1 (all parameters unknown) and Scenario 2 (elongation fixed). Points are coloured by planting configuration (A, B, C, D). The dashed line is the linear regression fit and Pearson </w:t>
-      </w:r>
-      <w:r>
-        <w:rPr>
-          <w:rFonts w:ascii="Times New Roman" w:hAnsi="Times New Roman"/>
-          <w:b w:val="0"/>
-          <w:i/>
-          <w:sz w:val="24"/>
-        </w:rPr>
-        <w:t>r</w:t>
-      </w:r>
-      <w:r>
-        <w:rPr>
-          <w:rFonts w:ascii="Times New Roman" w:hAnsi="Times New Roman"/>
-          <w:b w:val="0"/>
-          <w:i w:val="0"/>
-          <w:sz w:val="24"/>
-        </w:rPr>
-        <w:t xml:space="preserve"> is annotated on each panel. A low </w:t>
-      </w:r>
-      <w:r>
-        <w:rPr>
-          <w:rFonts w:ascii="Times New Roman" w:hAnsi="Times New Roman"/>
-          <w:b w:val="0"/>
-          <w:i/>
-          <w:sz w:val="24"/>
-        </w:rPr>
-        <w:t>J</w:t>
-      </w:r>
-      <w:r>
-        <w:rPr>
-          <w:rFonts w:ascii="Times New Roman" w:hAnsi="Times New Roman"/>
-          <w:b w:val="0"/>
-          <w:i w:val="0"/>
-          <w:sz w:val="24"/>
-          <w:vertAlign w:val="subscript"/>
-        </w:rPr>
-        <w:t>best</w:t>
-      </w:r>
-      <w:r>
-        <w:rPr>
-          <w:rFonts w:ascii="Times New Roman" w:hAnsi="Times New Roman"/>
-          <w:b w:val="0"/>
-          <w:i w:val="0"/>
-          <w:sz w:val="24"/>
-        </w:rPr>
-        <w:t xml:space="preserve"> (good minirhizotron fit) does not guarantee high structural skill score, demonstrating parameter equifinality.</w:t>
-      </w:r>
-    </w:p>
     <w:sectPr>
       <w:pgSz w:w="12240" w:h="15840"/>
       <w:pgMar w:top="1440" w:right="1800" w:bottom="1440" w:left="1800" w:header="720" w:footer="720" w:gutter="0"/>

</xml_diff>

<commit_message>
Color Fig 3/4 by planting configuration; circle legend markers; larger fonts; equal aspect
- Replace g_axial quintile coloring with config A/B/C/D (matching Fig 6 palette)
- Switch legend from square patches to circle Line2D markers; frameon=False
- Increase font sizes: titles 15-16pt, axis labels 14pt, ticks 13pt
- Reduce hspace/wspace for tighter layout
- Add set_aspect("equal") for proper 1:1 axes
- Update figure_captions.docx: Fig 3/4 now described as coloured by config

Co-Authored-By: Claude Sonnet 4.6 <noreply@anthropic.com>
</commit_message>
<xml_diff>
--- a/publication/figure_captions.docx
+++ b/publication/figure_captions.docx
@@ -87,7 +87,7 @@
           <w:i w:val="0"/>
           <w:sz w:val="24"/>
         </w:rPr>
-        <w:t xml:space="preserve"> Example three-dimensional root system architecture simulated by the functional–structural plant model (FSPM) for two plants in configuration B at day 84 (true parameter set), rendered with CairoMakie. </w:t>
+        <w:t xml:space="preserve"> Example three-dimensional root system architecture simulated by the functional-structural plant model (FSPM) for two plants in configuration B at day 84 (true parameter set), rendered with CairoMakie. </w:t>
       </w:r>
       <w:r>
         <w:rPr>
@@ -105,7 +105,7 @@
           <w:i w:val="0"/>
           <w:sz w:val="24"/>
         </w:rPr>
-        <w:t xml:space="preserve"> Simulated field-of-view (FOV) images at successive observation stations along the minirhizotron tube (sky-facing azimuth, az = 0°), illustrating the pixel-accurate observation model used to generate training and test data.</w:t>
+        <w:t xml:space="preserve"> Simulated field-of-view (FOV) images at successive observation stations along the minirhizotron tube (sky-facing azimuth, az = 0 deg), illustrating the pixel-accurate observation model used to generate training and test data.</w:t>
       </w:r>
     </w:p>
     <w:p>
@@ -145,35 +145,7 @@
           <w:i w:val="0"/>
           <w:sz w:val="24"/>
         </w:rPr>
-        <w:t xml:space="preserve"> = 7 observation seeds. Each panel shows predicted versus true parameter values for the N = 20 test cases, coloured by </w:t>
-      </w:r>
-      <w:r>
-        <w:rPr>
-          <w:rFonts w:ascii="Times New Roman" w:hAnsi="Times New Roman"/>
-          <w:b w:val="0"/>
-          <w:i/>
-          <w:sz w:val="24"/>
-        </w:rPr>
-        <w:t>g</w:t>
-      </w:r>
-      <w:r>
-        <w:rPr>
-          <w:rFonts w:ascii="Times New Roman" w:hAnsi="Times New Roman"/>
-          <w:b w:val="0"/>
-          <w:i w:val="0"/>
-          <w:sz w:val="24"/>
-          <w:vertAlign w:val="subscript"/>
-        </w:rPr>
-        <w:t>axial</w:t>
-      </w:r>
-      <w:r>
-        <w:rPr>
-          <w:rFonts w:ascii="Times New Roman" w:hAnsi="Times New Roman"/>
-          <w:b w:val="0"/>
-          <w:i w:val="0"/>
-          <w:sz w:val="24"/>
-        </w:rPr>
-        <w:t xml:space="preserve"> quintile (Q1 = slow growth, Q5 = fast growth). The dashed line is the 1:1 reference line; </w:t>
+        <w:t xml:space="preserve"> = 7 observation seeds. Each panel shows predicted versus true parameter values for the N = 20 test cases, coloured by planting configuration (A, B, C, D). The dashed line is the 1:1 reference line; </w:t>
       </w:r>
       <w:r>
         <w:rPr>
@@ -349,7 +321,7 @@
           <w:i w:val="0"/>
           <w:sz w:val="24"/>
         </w:rPr>
-        <w:t xml:space="preserve"> architectural parameters (θ, </w:t>
+        <w:t xml:space="preserve"> architectural parameters (theta, </w:t>
       </w:r>
       <w:r>
         <w:rPr>
@@ -569,7 +541,7 @@
           <w:i w:val="0"/>
           <w:sz w:val="24"/>
         </w:rPr>
-        <w:t xml:space="preserve"> (1, 7, 14) for the inverse-modelling approach (dashed lines) and the ML-based inference approach (solid lines) under Scenario 1 (all eight parameters unknown; red) and Scenario 2 (elongation parameters fixed at true values; blue). Shaded bands indicate ±1 standard error across the 20 test cases. The horizontal dotted line at SS = 0 marks the null-predictor baseline; values above zero indicate reconstruction better than the null predictor.</w:t>
+        <w:t xml:space="preserve"> (1, 7, 14) for the inverse-modelling approach (dashed lines) and the ML-based inference approach (solid lines) under Scenario 1 (all eight parameters unknown; red) and Scenario 2 (elongation parameters fixed at true values; blue). Shaded bands indicate +/-1 standard error across the 20 test cases. The horizontal short-dashed line at SS = 0 marks the null-predictor baseline; values above zero indicate reconstruction better than the null predictor.</w:t>
       </w:r>
     </w:p>
     <w:p>
@@ -675,7 +647,7 @@
           <w:i w:val="0"/>
           <w:sz w:val="24"/>
         </w:rPr>
-        <w:t xml:space="preserve"> = 1 (top row), </w:t>
+        <w:t xml:space="preserve"> = 1 (top row), </w:t>
       </w:r>
       <w:r>
         <w:rPr>
@@ -693,7 +665,7 @@
           <w:i w:val="0"/>
           <w:sz w:val="24"/>
         </w:rPr>
-        <w:t xml:space="preserve"> = 7 (middle row), and </w:t>
+        <w:t xml:space="preserve"> = 7 (middle row), and </w:t>
       </w:r>
       <w:r>
         <w:rPr>
@@ -711,7 +683,7 @@
           <w:i w:val="0"/>
           <w:sz w:val="24"/>
         </w:rPr>
-        <w:t xml:space="preserve"> = 14 (bottom row). Results are shown separately for Scenario 1 (all parameters unknown; left two columns) and Scenario 2 (elongation fixed; right two columns). Points are coloured by planting configuration (A, B, C, D). Pearson </w:t>
+        <w:t xml:space="preserve"> = 14 (bottom row). Results are shown separately for Scenario 1 (all parameters unknown; left two columns) and Scenario 2 (elongation fixed; right two columns). Points are coloured by planting configuration (A, B, C, D). Pearson </w:t>
       </w:r>
       <w:r>
         <w:rPr>
@@ -882,7 +854,7 @@
           <w:i w:val="0"/>
           <w:sz w:val="24"/>
         </w:rPr>
-        <w:t xml:space="preserve"> / (√</w:t>
+        <w:t xml:space="preserve"> / (sqrt(</w:t>
       </w:r>
       <w:r>
         <w:rPr>
@@ -900,7 +872,7 @@
           <w:i w:val="0"/>
           <w:sz w:val="24"/>
         </w:rPr>
-        <w:t>·μ</w:t>
+        <w:t>) x mu</w:t>
       </w:r>
       <w:r>
         <w:rPr>
@@ -911,16 +883,6 @@
           <w:vertAlign w:val="subscript"/>
         </w:rPr>
         <w:t>i</w:t>
-      </w:r>
-      <w:r>
-        <w:rPr>
-          <w:rFonts w:ascii="Times New Roman" w:hAnsi="Times New Roman"/>
-          <w:b w:val="0"/>
-          <w:i w:val="0"/>
-          <w:sz w:val="24"/>
-          <w:vertAlign w:val="superscript"/>
-        </w:rPr>
-        <w:t>−1</w:t>
       </w:r>
       <w:r>
         <w:rPr>
@@ -957,7 +919,7 @@
           <w:i w:val="0"/>
           <w:sz w:val="24"/>
         </w:rPr>
-        <w:t xml:space="preserve"> and μ</w:t>
+        <w:t xml:space="preserve"> and mu</w:t>
       </w:r>
       <w:r>
         <w:rPr>
@@ -1012,7 +974,7 @@
           <w:i w:val="0"/>
           <w:sz w:val="24"/>
         </w:rPr>
-        <w:t xml:space="preserve"> CV averaged across three feature channels (root length, root presence, crossing angle) over all N = 1,270 training samples; the shaded band shows the P25–P75 range. Dashed lines indicate extrapolation beyond the observed range (</w:t>
+        <w:t xml:space="preserve"> CV averaged across three feature channels (root length, root presence, crossing angle) over all N = 1,270 training samples; the shaded band shows the P25-P75 range. Dashed lines indicate extrapolation beyond the observed range (</w:t>
       </w:r>
       <w:r>
         <w:rPr>
@@ -1030,7 +992,7 @@
           <w:i w:val="0"/>
           <w:sz w:val="24"/>
         </w:rPr>
-        <w:t xml:space="preserve"> &gt; 20). </w:t>
+        <w:t xml:space="preserve"> &gt; 20). </w:t>
       </w:r>
       <w:r>
         <w:rPr>
@@ -1094,7 +1056,7 @@
           <w:i w:val="0"/>
           <w:sz w:val="24"/>
         </w:rPr>
-        <w:t xml:space="preserve"> = 7 and </w:t>
+        <w:t xml:space="preserve"> = 7 and </w:t>
       </w:r>
       <w:r>
         <w:rPr>
@@ -1112,7 +1074,7 @@
           <w:i w:val="0"/>
           <w:sz w:val="24"/>
         </w:rPr>
-        <w:t xml:space="preserve"> = 14. Horizontal dotted lines indicate 10% and 20% CV thresholds.</w:t>
+        <w:t xml:space="preserve"> = 14. Horizontal dotted lines indicate 10% and 20% CV thresholds.</w:t>
       </w:r>
     </w:p>
     <w:p>
@@ -1152,7 +1114,7 @@
           <w:i w:val="0"/>
           <w:sz w:val="24"/>
         </w:rPr>
-        <w:t xml:space="preserve"> = 1 (rows 1–2) and </w:t>
+        <w:t xml:space="preserve"> = 1 (rows 1-2) and </w:t>
       </w:r>
       <w:r>
         <w:rPr>
@@ -1170,7 +1132,7 @@
           <w:i w:val="0"/>
           <w:sz w:val="24"/>
         </w:rPr>
-        <w:t xml:space="preserve"> = 14 (rows 3–4). Layout and colour coding follow Fig. 3.</w:t>
+        <w:t xml:space="preserve"> = 14 (rows 3-4). Layout and colour coding follow Fig. 3.</w:t>
       </w:r>
     </w:p>
     <w:p>
@@ -1210,7 +1172,7 @@
           <w:i w:val="0"/>
           <w:sz w:val="24"/>
         </w:rPr>
-        <w:t xml:space="preserve"> = 1 (rows 1–2) and </w:t>
+        <w:t xml:space="preserve"> = 1 (rows 1-2) and </w:t>
       </w:r>
       <w:r>
         <w:rPr>
@@ -1228,7 +1190,7 @@
           <w:i w:val="0"/>
           <w:sz w:val="24"/>
         </w:rPr>
-        <w:t xml:space="preserve"> = 14 (rows 3–4). Layout and colour coding follow Fig. 4.</w:t>
+        <w:t xml:space="preserve"> = 14 (rows 3-4). Layout and colour coding follow Fig. 4.</w:t>
       </w:r>
     </w:p>
     <w:sectPr>

</xml_diff>

<commit_message>
Restructure supplementary figures: S2/S3 per-k, S3(old)->S4
- Fig S2: Scenario 1 k=1, same 6-row elongation/architectural GridSpec as Fig 3
- Fig S3: Scenario 1 k=14, same layout
- Fig S4: Scenario 2 k=1 & k=14 (renamed from old Fig S3)
- Remove old flat 4x8 figS2 script and figure
- Update figure_captions.docx accordingly

Co-Authored-By: Claude Sonnet 4.6 <noreply@anthropic.com>
</commit_message>
<xml_diff>
--- a/publication/figure_captions.docx
+++ b/publication/figure_captions.docx
@@ -1114,7 +1114,29 @@
           <w:i w:val="0"/>
           <w:sz w:val="24"/>
         </w:rPr>
-        <w:t xml:space="preserve"> = 1 (rows 1-2) and </w:t>
+        <w:t xml:space="preserve"> = 1. Layout and colour coding follow Fig. 3.</w:t>
+      </w:r>
+    </w:p>
+    <w:p>
+      <w:pPr>
+        <w:spacing w:before="120" w:after="200"/>
+      </w:pPr>
+      <w:r>
+        <w:rPr>
+          <w:rFonts w:ascii="Times New Roman" w:hAnsi="Times New Roman"/>
+          <w:b/>
+          <w:sz w:val="24"/>
+        </w:rPr>
+        <w:t xml:space="preserve">Figure S3. </w:t>
+      </w:r>
+      <w:r>
+        <w:rPr>
+          <w:rFonts w:ascii="Times New Roman" w:hAnsi="Times New Roman"/>
+          <w:b w:val="0"/>
+          <w:i w:val="0"/>
+          <w:sz w:val="24"/>
+        </w:rPr>
+        <w:t xml:space="preserve">Parameter recovery for Scenario 1 (all eight parameters unknown) at </w:t>
       </w:r>
       <w:r>
         <w:rPr>
@@ -1132,7 +1154,7 @@
           <w:i w:val="0"/>
           <w:sz w:val="24"/>
         </w:rPr>
-        <w:t xml:space="preserve"> = 14 (rows 3-4). Layout and colour coding follow Fig. 3.</w:t>
+        <w:t xml:space="preserve"> = 14. Layout and colour coding follow Fig. 3.</w:t>
       </w:r>
     </w:p>
     <w:p>
@@ -1145,7 +1167,7 @@
           <w:b/>
           <w:sz w:val="24"/>
         </w:rPr>
-        <w:t xml:space="preserve">Figure S3. </w:t>
+        <w:t xml:space="preserve">Figure S4. </w:t>
       </w:r>
       <w:r>
         <w:rPr>

</xml_diff>